<commit_message>
Remove obsolete files and enhance Alba 2001 education analysis documentation
- Deleted temporary and unnecessary files, including `~$LS_HSandB_issues.docx` and `~$holar_Romania_Better_School_Paper_Plain_English_Story.docx`, to streamline the project structure.
- Updated `VECTOR_CURRENT_STATE.md` to reflect the latest findings from the Alba 2001 structural audit, clarifying the status of the data and next steps for analysis.
- Introduced new documentation files, including `Scholar_Romania_2001_Joint_Scientific_Specification_20260929.md`, to outline the joint scientific specifications and decisions for future research.
- Enhanced the `EDUCATION_20260929_romania_gymnasium_differentiation_v1.py` script to support the differentiation analysis of gymnasium applicants based on national examination performance.

These changes improve the organization and clarity of the education analysis framework, supporting enhanced data management and research capabilities.
</commit_message>
<xml_diff>
--- a/3-Master_Plan/VECTOR_work/new_VECTOR_work/NELS_HSandB_issues.docx
+++ b/3-Master_Plan/VECTOR_work/new_VECTOR_work/NELS_HSandB_issues.docx
@@ -510,7 +510,7 @@
           <w:noProof/>
           <w:kern w:val="0"/>
         </w:rPr>
-        <w:pict w14:anchorId="751F3853">
+        <w:pict w14:anchorId="0140D8F6">
           <v:rect id="_x0000_i1027" alt="" style="width:468pt;height:.05pt;mso-width-percent:0;mso-height-percent:0;mso-width-percent:0;mso-height-percent:0" o:hralign="center" o:hrstd="t" o:hr="t" fillcolor="#a0a0a0" stroked="f"/>
         </w:pict>
       </w:r>
@@ -1335,7 +1335,7 @@
           <w:noProof/>
           <w:kern w:val="0"/>
         </w:rPr>
-        <w:pict w14:anchorId="2FC67150">
+        <w:pict w14:anchorId="23F85632">
           <v:rect id="_x0000_i1026" alt="" style="width:468pt;height:.05pt;mso-width-percent:0;mso-height-percent:0;mso-width-percent:0;mso-height-percent:0" o:hralign="center" o:hrstd="t" o:hr="t" fillcolor="#a0a0a0" stroked="f"/>
         </w:pict>
       </w:r>
@@ -2103,7 +2103,7 @@
           <w:noProof/>
           <w:kern w:val="0"/>
         </w:rPr>
-        <w:pict w14:anchorId="7FF7CE12">
+        <w:pict w14:anchorId="4FBC8937">
           <v:rect id="_x0000_i1025" alt="" style="width:468pt;height:.05pt;mso-width-percent:0;mso-height-percent:0;mso-width-percent:0;mso-height-percent:0" o:hralign="center" o:hrstd="t" o:hr="t" fillcolor="#a0a0a0" stroked="f"/>
         </w:pict>
       </w:r>
@@ -2712,6 +2712,16 @@
         </w:rPr>
         <w:t>That sampling issue—not the absence of a perfect college story—is the most important immediate concern.</w:t>
       </w:r>
+    </w:p>
+    <w:p>
+      <w:pPr>
+        <w:spacing w:before="100" w:beforeAutospacing="1" w:after="100" w:afterAutospacing="1" w:line="240" w:lineRule="auto"/>
+        <w:rPr>
+          <w:rFonts w:ascii="Times New Roman" w:eastAsia="Times New Roman" w:hAnsi="Times New Roman" w:cs="Times New Roman"/>
+          <w:kern w:val="0"/>
+          <w14:ligatures w14:val="none"/>
+        </w:rPr>
+      </w:pPr>
     </w:p>
     <w:p/>
     <w:sectPr>

</xml_diff>